<commit_message>
Add github repository to the report
</commit_message>
<xml_diff>
--- a/report.docx
+++ b/report.docx
@@ -532,6 +532,7 @@
           </w:placeholder>
           <w:text/>
         </w:sdtPr>
+        <w:sdtEndPr/>
         <w:sdtContent>
           <w:r>
             <w:rPr>
@@ -601,6 +602,7 @@
           </w:placeholder>
           <w:text/>
         </w:sdtPr>
+        <w:sdtEndPr/>
         <w:sdtContent>
           <w:r>
             <w:rPr>
@@ -720,8 +722,6 @@
         </w:rPr>
         <w:t xml:space="preserve">и </w:t>
       </w:r>
-      <w:bookmarkStart w:id="0" w:name="_GoBack"/>
-      <w:bookmarkEnd w:id="0"/>
       <w:r>
         <w:rPr>
           <w:rFonts w:ascii="Times New Roman" w:eastAsia="Times New Roman" w:hAnsi="Times New Roman" w:cs="Times New Roman"/>
@@ -772,6 +772,7 @@
         </w:placeholder>
         <w:text/>
       </w:sdtPr>
+      <w:sdtEndPr/>
       <w:sdtContent>
         <w:p>
           <w:pPr>
@@ -799,18 +800,7 @@
               <w:lang w:eastAsia="ru-RU"/>
               <w14:ligatures w14:val="none"/>
             </w:rPr>
-            <w:t>Мясников Артём Валерьевич</w:t>
-          </w:r>
-          <w:r>
-            <w:rPr>
-              <w:rFonts w:ascii="Times New Roman" w:eastAsia="Times New Roman" w:hAnsi="Times New Roman" w:cs="Times New Roman"/>
-              <w:kern w:val="0"/>
-              <w:sz w:val="24"/>
-              <w:szCs w:val="24"/>
-              <w:lang w:eastAsia="ru-RU"/>
-              <w14:ligatures w14:val="none"/>
-            </w:rPr>
-            <w:t xml:space="preserve"> P3123</w:t>
+            <w:t>Мясников Артём Валерьевич P3123</w:t>
           </w:r>
         </w:p>
       </w:sdtContent>
@@ -831,6 +821,7 @@
         </w:placeholder>
         <w:text/>
       </w:sdtPr>
+      <w:sdtEndPr/>
       <w:sdtContent>
         <w:p>
           <w:pPr>
@@ -858,40 +849,7 @@
               <w:lang w:eastAsia="ru-RU"/>
               <w14:ligatures w14:val="none"/>
             </w:rPr>
-            <w:t>Музыка</w:t>
-          </w:r>
-          <w:r>
-            <w:rPr>
-              <w:rFonts w:ascii="Times New Roman" w:eastAsia="Times New Roman" w:hAnsi="Times New Roman" w:cs="Times New Roman"/>
-              <w:kern w:val="0"/>
-              <w:sz w:val="24"/>
-              <w:szCs w:val="24"/>
-              <w:lang w:eastAsia="ru-RU"/>
-              <w14:ligatures w14:val="none"/>
-            </w:rPr>
-            <w:t xml:space="preserve"> </w:t>
-          </w:r>
-          <w:r>
-            <w:rPr>
-              <w:rFonts w:ascii="Times New Roman" w:eastAsia="Times New Roman" w:hAnsi="Times New Roman" w:cs="Times New Roman"/>
-              <w:kern w:val="0"/>
-              <w:sz w:val="24"/>
-              <w:szCs w:val="24"/>
-              <w:lang w:eastAsia="ru-RU"/>
-              <w14:ligatures w14:val="none"/>
-            </w:rPr>
-            <w:t xml:space="preserve">Олег Сергеевич </w:t>
-          </w:r>
-          <w:r>
-            <w:rPr>
-              <w:rFonts w:ascii="Times New Roman" w:eastAsia="Times New Roman" w:hAnsi="Times New Roman" w:cs="Times New Roman"/>
-              <w:kern w:val="0"/>
-              <w:sz w:val="24"/>
-              <w:szCs w:val="24"/>
-              <w:lang w:eastAsia="ru-RU"/>
-              <w14:ligatures w14:val="none"/>
-            </w:rPr>
-            <w:t>P3120</w:t>
+            <w:t>Музыка Олег Сергеевич P3120</w:t>
           </w:r>
         </w:p>
       </w:sdtContent>
@@ -912,6 +870,7 @@
         </w:placeholder>
         <w:text/>
       </w:sdtPr>
+      <w:sdtEndPr/>
       <w:sdtContent>
         <w:p>
           <w:pPr>
@@ -939,29 +898,7 @@
               <w:lang w:eastAsia="ru-RU"/>
               <w14:ligatures w14:val="none"/>
             </w:rPr>
-            <w:t>Гнездилов Дмитрий</w:t>
-          </w:r>
-          <w:r>
-            <w:rPr>
-              <w:rFonts w:ascii="Times New Roman" w:eastAsia="Times New Roman" w:hAnsi="Times New Roman" w:cs="Times New Roman"/>
-              <w:kern w:val="0"/>
-              <w:sz w:val="24"/>
-              <w:szCs w:val="24"/>
-              <w:lang w:eastAsia="ru-RU"/>
-              <w14:ligatures w14:val="none"/>
-            </w:rPr>
-            <w:t xml:space="preserve"> </w:t>
-          </w:r>
-          <w:r>
-            <w:rPr>
-              <w:rFonts w:ascii="Times New Roman" w:eastAsia="Times New Roman" w:hAnsi="Times New Roman" w:cs="Times New Roman"/>
-              <w:kern w:val="0"/>
-              <w:sz w:val="24"/>
-              <w:szCs w:val="24"/>
-              <w:lang w:eastAsia="ru-RU"/>
-              <w14:ligatures w14:val="none"/>
-            </w:rPr>
-            <w:t>Вадимович P3123</w:t>
+            <w:t>Гнездилов Дмитрий Вадимович P3123</w:t>
           </w:r>
         </w:p>
       </w:sdtContent>
@@ -982,6 +919,7 @@
         </w:placeholder>
         <w:text/>
       </w:sdtPr>
+      <w:sdtEndPr/>
       <w:sdtContent>
         <w:p>
           <w:pPr>
@@ -1009,29 +947,7 @@
               <w:lang w:eastAsia="ru-RU"/>
               <w14:ligatures w14:val="none"/>
             </w:rPr>
-            <w:t>Исаев Сергей</w:t>
-          </w:r>
-          <w:r>
-            <w:rPr>
-              <w:rFonts w:ascii="Times New Roman" w:eastAsia="Times New Roman" w:hAnsi="Times New Roman" w:cs="Times New Roman"/>
-              <w:kern w:val="0"/>
-              <w:sz w:val="24"/>
-              <w:szCs w:val="24"/>
-              <w:lang w:eastAsia="ru-RU"/>
-              <w14:ligatures w14:val="none"/>
-            </w:rPr>
-            <w:t xml:space="preserve"> </w:t>
-          </w:r>
-          <w:r>
-            <w:rPr>
-              <w:rFonts w:ascii="Times New Roman" w:eastAsia="Times New Roman" w:hAnsi="Times New Roman" w:cs="Times New Roman"/>
-              <w:kern w:val="0"/>
-              <w:sz w:val="24"/>
-              <w:szCs w:val="24"/>
-              <w:lang w:eastAsia="ru-RU"/>
-              <w14:ligatures w14:val="none"/>
-            </w:rPr>
-            <w:t>Алексеевич P3123</w:t>
+            <w:t>Исаев Сергей Алексеевич P3123</w:t>
           </w:r>
         </w:p>
       </w:sdtContent>
@@ -1052,6 +968,7 @@
         </w:placeholder>
         <w:text/>
       </w:sdtPr>
+      <w:sdtEndPr/>
       <w:sdtContent>
         <w:p>
           <w:pPr>
@@ -1079,51 +996,7 @@
               <w:lang w:eastAsia="ru-RU"/>
               <w14:ligatures w14:val="none"/>
             </w:rPr>
-            <w:t>Лебедев</w:t>
-          </w:r>
-          <w:r>
-            <w:rPr>
-              <w:rFonts w:ascii="Times New Roman" w:eastAsia="Times New Roman" w:hAnsi="Times New Roman" w:cs="Times New Roman"/>
-              <w:kern w:val="0"/>
-              <w:sz w:val="24"/>
-              <w:szCs w:val="24"/>
-              <w:lang w:eastAsia="ru-RU"/>
-              <w14:ligatures w14:val="none"/>
-            </w:rPr>
-            <w:t xml:space="preserve"> </w:t>
-          </w:r>
-          <w:r>
-            <w:rPr>
-              <w:rFonts w:ascii="Times New Roman" w:eastAsia="Times New Roman" w:hAnsi="Times New Roman" w:cs="Times New Roman"/>
-              <w:kern w:val="0"/>
-              <w:sz w:val="24"/>
-              <w:szCs w:val="24"/>
-              <w:lang w:eastAsia="ru-RU"/>
-              <w14:ligatures w14:val="none"/>
-            </w:rPr>
-            <w:t>Алексей</w:t>
-          </w:r>
-          <w:r>
-            <w:rPr>
-              <w:rFonts w:ascii="Times New Roman" w:eastAsia="Times New Roman" w:hAnsi="Times New Roman" w:cs="Times New Roman"/>
-              <w:kern w:val="0"/>
-              <w:sz w:val="24"/>
-              <w:szCs w:val="24"/>
-              <w:lang w:eastAsia="ru-RU"/>
-              <w14:ligatures w14:val="none"/>
-            </w:rPr>
-            <w:t xml:space="preserve"> </w:t>
-          </w:r>
-          <w:r>
-            <w:rPr>
-              <w:rFonts w:ascii="Times New Roman" w:eastAsia="Times New Roman" w:hAnsi="Times New Roman" w:cs="Times New Roman"/>
-              <w:kern w:val="0"/>
-              <w:sz w:val="24"/>
-              <w:szCs w:val="24"/>
-              <w:lang w:eastAsia="ru-RU"/>
-              <w14:ligatures w14:val="none"/>
-            </w:rPr>
-            <w:t>Алексеевич P3123</w:t>
+            <w:t>Лебедев Алексей Алексеевич P3123</w:t>
           </w:r>
         </w:p>
       </w:sdtContent>
@@ -1144,6 +1017,7 @@
         </w:placeholder>
         <w:text/>
       </w:sdtPr>
+      <w:sdtEndPr/>
       <w:sdtContent>
         <w:p>
           <w:pPr>
@@ -1162,80 +1036,6 @@
               <w14:ligatures w14:val="none"/>
             </w:rPr>
           </w:pPr>
-          <w:sdt>
-            <w:sdtPr>
-              <w:rPr>
-                <w:rFonts w:ascii="Times New Roman" w:eastAsia="Times New Roman" w:hAnsi="Times New Roman" w:cs="Times New Roman"/>
-                <w:kern w:val="0"/>
-                <w:sz w:val="24"/>
-                <w:szCs w:val="24"/>
-                <w:lang w:eastAsia="ru-RU"/>
-                <w14:ligatures w14:val="none"/>
-              </w:rPr>
-              <w:id w:val="-905836312"/>
-              <w:placeholder>
-                <w:docPart w:val="B8AEE3A36E2541D393D8F3A17F21267A"/>
-              </w:placeholder>
-              <w:text/>
-            </w:sdtPr>
-            <w:sdtContent>
-              <w:r>
-                <w:rPr>
-                  <w:rFonts w:ascii="Times New Roman" w:eastAsia="Times New Roman" w:hAnsi="Times New Roman" w:cs="Times New Roman"/>
-                  <w:kern w:val="0"/>
-                  <w:sz w:val="24"/>
-                  <w:szCs w:val="24"/>
-                  <w:lang w:eastAsia="ru-RU"/>
-                  <w14:ligatures w14:val="none"/>
-                </w:rPr>
-                <w:t>Лебедев</w:t>
-              </w:r>
-              <w:r>
-                <w:rPr>
-                  <w:rFonts w:ascii="Times New Roman" w:eastAsia="Times New Roman" w:hAnsi="Times New Roman" w:cs="Times New Roman"/>
-                  <w:kern w:val="0"/>
-                  <w:sz w:val="24"/>
-                  <w:szCs w:val="24"/>
-                  <w:lang w:eastAsia="ru-RU"/>
-                  <w14:ligatures w14:val="none"/>
-                </w:rPr>
-                <w:t xml:space="preserve"> </w:t>
-              </w:r>
-              <w:r>
-                <w:rPr>
-                  <w:rFonts w:ascii="Times New Roman" w:eastAsia="Times New Roman" w:hAnsi="Times New Roman" w:cs="Times New Roman"/>
-                  <w:kern w:val="0"/>
-                  <w:sz w:val="24"/>
-                  <w:szCs w:val="24"/>
-                  <w:lang w:eastAsia="ru-RU"/>
-                  <w14:ligatures w14:val="none"/>
-                </w:rPr>
-                <w:t>Александр</w:t>
-              </w:r>
-              <w:r>
-                <w:rPr>
-                  <w:rFonts w:ascii="Times New Roman" w:eastAsia="Times New Roman" w:hAnsi="Times New Roman" w:cs="Times New Roman"/>
-                  <w:kern w:val="0"/>
-                  <w:sz w:val="24"/>
-                  <w:szCs w:val="24"/>
-                  <w:lang w:eastAsia="ru-RU"/>
-                  <w14:ligatures w14:val="none"/>
-                </w:rPr>
-                <w:t xml:space="preserve"> </w:t>
-              </w:r>
-              <w:r>
-                <w:rPr>
-                  <w:rFonts w:ascii="Times New Roman" w:eastAsia="Times New Roman" w:hAnsi="Times New Roman" w:cs="Times New Roman"/>
-                  <w:kern w:val="0"/>
-                  <w:sz w:val="24"/>
-                  <w:szCs w:val="24"/>
-                  <w:lang w:eastAsia="ru-RU"/>
-                  <w14:ligatures w14:val="none"/>
-                </w:rPr>
-                <w:t>Алексеевич</w:t>
-              </w:r>
-            </w:sdtContent>
-          </w:sdt>
           <w:r>
             <w:rPr>
               <w:rFonts w:ascii="Times New Roman" w:eastAsia="Times New Roman" w:hAnsi="Times New Roman" w:cs="Times New Roman"/>
@@ -1245,18 +1045,7 @@
               <w:lang w:eastAsia="ru-RU"/>
               <w14:ligatures w14:val="none"/>
             </w:rPr>
-            <w:t xml:space="preserve"> </w:t>
-          </w:r>
-          <w:r>
-            <w:rPr>
-              <w:rFonts w:ascii="Times New Roman" w:eastAsia="Times New Roman" w:hAnsi="Times New Roman" w:cs="Times New Roman"/>
-              <w:kern w:val="0"/>
-              <w:sz w:val="24"/>
-              <w:szCs w:val="24"/>
-              <w:lang w:eastAsia="ru-RU"/>
-              <w14:ligatures w14:val="none"/>
-            </w:rPr>
-            <w:t>P3123</w:t>
+            <w:t>Лебедев Александр Алексеевич P3123</w:t>
           </w:r>
         </w:p>
       </w:sdtContent>
@@ -1277,6 +1066,7 @@
         </w:placeholder>
         <w:text/>
       </w:sdtPr>
+      <w:sdtEndPr/>
       <w:sdtContent>
         <w:p>
           <w:pPr>
@@ -1317,40 +1107,7 @@
               <w:lang w:eastAsia="ru-RU"/>
               <w14:ligatures w14:val="none"/>
             </w:rPr>
-            <w:t xml:space="preserve"> </w:t>
-          </w:r>
-          <w:r>
-            <w:rPr>
-              <w:rFonts w:ascii="Times New Roman" w:eastAsia="Times New Roman" w:hAnsi="Times New Roman" w:cs="Times New Roman"/>
-              <w:kern w:val="0"/>
-              <w:sz w:val="24"/>
-              <w:szCs w:val="24"/>
-              <w:lang w:eastAsia="ru-RU"/>
-              <w14:ligatures w14:val="none"/>
-            </w:rPr>
-            <w:t>Татьяна</w:t>
-          </w:r>
-          <w:r>
-            <w:rPr>
-              <w:rFonts w:ascii="Times New Roman" w:eastAsia="Times New Roman" w:hAnsi="Times New Roman" w:cs="Times New Roman"/>
-              <w:kern w:val="0"/>
-              <w:sz w:val="24"/>
-              <w:szCs w:val="24"/>
-              <w:lang w:eastAsia="ru-RU"/>
-              <w14:ligatures w14:val="none"/>
-            </w:rPr>
-            <w:t xml:space="preserve"> </w:t>
-          </w:r>
-          <w:r>
-            <w:rPr>
-              <w:rFonts w:ascii="Times New Roman" w:eastAsia="Times New Roman" w:hAnsi="Times New Roman" w:cs="Times New Roman"/>
-              <w:kern w:val="0"/>
-              <w:sz w:val="24"/>
-              <w:szCs w:val="24"/>
-              <w:lang w:eastAsia="ru-RU"/>
-              <w14:ligatures w14:val="none"/>
-            </w:rPr>
-            <w:t>Игоревна P3123</w:t>
+            <w:t xml:space="preserve"> Татьяна Игоревна P3123</w:t>
           </w:r>
         </w:p>
       </w:sdtContent>
@@ -1371,6 +1128,7 @@
         </w:placeholder>
         <w:text/>
       </w:sdtPr>
+      <w:sdtEndPr/>
       <w:sdtContent>
         <w:p>
           <w:pPr>
@@ -1411,40 +1169,7 @@
               <w:lang w:eastAsia="ru-RU"/>
               <w14:ligatures w14:val="none"/>
             </w:rPr>
-            <w:t xml:space="preserve"> </w:t>
-          </w:r>
-          <w:r>
-            <w:rPr>
-              <w:rFonts w:ascii="Times New Roman" w:eastAsia="Times New Roman" w:hAnsi="Times New Roman" w:cs="Times New Roman"/>
-              <w:kern w:val="0"/>
-              <w:sz w:val="24"/>
-              <w:szCs w:val="24"/>
-              <w:lang w:eastAsia="ru-RU"/>
-              <w14:ligatures w14:val="none"/>
-            </w:rPr>
-            <w:t>Даниил</w:t>
-          </w:r>
-          <w:r>
-            <w:rPr>
-              <w:rFonts w:ascii="Times New Roman" w:eastAsia="Times New Roman" w:hAnsi="Times New Roman" w:cs="Times New Roman"/>
-              <w:kern w:val="0"/>
-              <w:sz w:val="24"/>
-              <w:szCs w:val="24"/>
-              <w:lang w:eastAsia="ru-RU"/>
-              <w14:ligatures w14:val="none"/>
-            </w:rPr>
-            <w:t xml:space="preserve"> </w:t>
-          </w:r>
-          <w:r>
-            <w:rPr>
-              <w:rFonts w:ascii="Times New Roman" w:eastAsia="Times New Roman" w:hAnsi="Times New Roman" w:cs="Times New Roman"/>
-              <w:kern w:val="0"/>
-              <w:sz w:val="24"/>
-              <w:szCs w:val="24"/>
-              <w:lang w:eastAsia="ru-RU"/>
-              <w14:ligatures w14:val="none"/>
-            </w:rPr>
-            <w:t>Игоревич P3123</w:t>
+            <w:t xml:space="preserve"> Даниил Игоревич P3123</w:t>
           </w:r>
         </w:p>
       </w:sdtContent>
@@ -1490,6 +1215,7 @@
           </w:placeholder>
           <w:text/>
         </w:sdtPr>
+        <w:sdtEndPr/>
         <w:sdtContent>
           <w:r>
             <w:rPr>
@@ -1500,18 +1226,7 @@
               <w:lang w:eastAsia="ru-RU"/>
               <w14:ligatures w14:val="none"/>
             </w:rPr>
-            <w:t xml:space="preserve">Билый </w:t>
-          </w:r>
-          <w:r>
-            <w:rPr>
-              <w:rFonts w:ascii="Times New Roman" w:eastAsia="Times New Roman" w:hAnsi="Times New Roman" w:cs="Times New Roman"/>
-              <w:kern w:val="0"/>
-              <w:sz w:val="24"/>
-              <w:szCs w:val="24"/>
-              <w:lang w:eastAsia="ru-RU"/>
-              <w14:ligatures w14:val="none"/>
-            </w:rPr>
-            <w:t>Андрей Михайлович</w:t>
+            <w:t>Билый Андрей Михайлович</w:t>
           </w:r>
         </w:sdtContent>
       </w:sdt>
@@ -2540,6 +2255,22 @@
         </w:rPr>
         <w:t>Составляется отчет с описанием выполненных задач, функциональных возможностей портала и используемых инструментов. Предоставляется программный код.</w:t>
       </w:r>
+      <w:r>
+        <w:rPr>
+          <w:rFonts w:ascii="Times New Roman" w:hAnsi="Times New Roman" w:cs="Times New Roman"/>
+          <w:lang w:val="en-US"/>
+        </w:rPr>
+        <w:t xml:space="preserve"> </w:t>
+      </w:r>
+      <w:r>
+        <w:rPr>
+          <w:rFonts w:ascii="Times New Roman" w:hAnsi="Times New Roman" w:cs="Times New Roman"/>
+          <w:lang w:val="en-US"/>
+        </w:rPr>
+        <w:t>https://github.com/ArteMyasnik/creativeLabel_opd_project</w:t>
+      </w:r>
+      <w:bookmarkStart w:id="0" w:name="_GoBack"/>
+      <w:bookmarkEnd w:id="0"/>
       <w:r>
         <w:rPr>
           <w:rFonts w:ascii="Times New Roman" w:hAnsi="Times New Roman" w:cs="Times New Roman"/>
@@ -2770,6 +2501,7 @@
   <w:style w:type="character" w:default="1" w:styleId="a0">
     <w:name w:val="Default Paragraph Font"/>
     <w:uiPriority w:val="1"/>
+    <w:semiHidden/>
     <w:unhideWhenUsed/>
   </w:style>
   <w:style w:type="table" w:default="1" w:styleId="a1">
@@ -3003,6 +2735,7 @@
   <w:style w:type="character" w:default="1" w:styleId="a0">
     <w:name w:val="Default Paragraph Font"/>
     <w:uiPriority w:val="1"/>
+    <w:semiHidden/>
     <w:unhideWhenUsed/>
   </w:style>
   <w:style w:type="table" w:default="1" w:styleId="a1">
@@ -3334,35 +3067,6 @@
         </w:p>
       </w:docPartBody>
     </w:docPart>
-    <w:docPart>
-      <w:docPartPr>
-        <w:name w:val="B8AEE3A36E2541D393D8F3A17F21267A"/>
-        <w:category>
-          <w:name w:val="Общие"/>
-          <w:gallery w:val="placeholder"/>
-        </w:category>
-        <w:types>
-          <w:type w:val="bbPlcHdr"/>
-        </w:types>
-        <w:behaviors>
-          <w:behavior w:val="content"/>
-        </w:behaviors>
-        <w:guid w:val="{C3A666EE-3B2C-4DDE-A073-5A00EC00EF49}"/>
-      </w:docPartPr>
-      <w:docPartBody>
-        <w:p>
-          <w:pPr>
-            <w:pStyle w:val="B8AEE3A36E2541D393D8F3A17F21267A"/>
-          </w:pPr>
-          <w:r>
-            <w:rPr>
-              <w:rStyle w:val="a3"/>
-            </w:rPr>
-            <w:t>Место для ввода текста.</w:t>
-          </w:r>
-        </w:p>
-      </w:docPartBody>
-    </w:docPart>
   </w:docParts>
 </w:glossaryDocument>
 </file>
@@ -3385,19 +3089,20 @@
   </w:font>
   <w:font w:name="Tahoma">
     <w:panose1 w:val="020B0604030504040204"/>
-    <w:charset w:val="CC"/>
+    <w:charset w:val="00"/>
     <w:family w:val="swiss"/>
+    <w:notTrueType/>
     <w:pitch w:val="variable"/>
-    <w:sig w:usb0="E1002EFF" w:usb1="C000605B" w:usb2="00000029" w:usb3="00000000" w:csb0="000101FF" w:csb1="00000000"/>
+    <w:sig w:usb0="00000003" w:usb1="00000000" w:usb2="00000000" w:usb3="00000000" w:csb0="00000001" w:csb1="00000000"/>
   </w:font>
   <w:font w:name="PMingLiU">
-    <w:altName w:val="Arial Unicode MS"/>
+    <w:altName w:val="新細明體"/>
     <w:panose1 w:val="02010601000101010101"/>
     <w:charset w:val="88"/>
     <w:family w:val="auto"/>
     <w:notTrueType/>
     <w:pitch w:val="variable"/>
-    <w:sig w:usb0="00000000" w:usb1="08080000" w:usb2="00000010" w:usb3="00000000" w:csb0="00100000" w:csb1="00000000"/>
+    <w:sig w:usb0="00000001" w:usb1="08080000" w:usb2="00000010" w:usb3="00000000" w:csb0="00100000" w:csb1="00000000"/>
   </w:font>
   <w:font w:name="Calibri Light">
     <w:panose1 w:val="020F0302020204030204"/>
@@ -3432,6 +3137,8 @@
     <w:rsidRoot w:val="007252C4"/>
     <w:rsid w:val="0016244D"/>
     <w:rsid w:val="007252C4"/>
+    <w:rsid w:val="00902949"/>
+    <w:rsid w:val="00C22022"/>
   </w:rsids>
   <m:mathPr>
     <m:mathFont m:val="Cambria Math"/>
@@ -4269,7 +3976,7 @@
   <a:extraClrSchemeLst/>
   <a:extLst>
     <a:ext uri="{05A4C25C-085E-4340-85A3-A5531E510DB2}">
-      <thm15:themeFamily xmlns:thm15="http://schemas.microsoft.com/office/thememl/2012/main" xmlns="" name="Office Theme" id="{62F939B6-93AF-4DB8-9C6B-D6C7DFDC589F}" vid="{4A3C46E8-61CC-4603-A589-7422A47A8E4A}"/>
+      <thm15:themeFamily xmlns="" xmlns:thm15="http://schemas.microsoft.com/office/thememl/2012/main" name="Office Theme" id="{62F939B6-93AF-4DB8-9C6B-D6C7DFDC589F}" vid="{4A3C46E8-61CC-4603-A589-7422A47A8E4A}"/>
     </a:ext>
   </a:extLst>
 </a:theme>

</xml_diff>